<commit_message>
First release of the DAMOCLES platform
</commit_message>
<xml_diff>
--- a/deliverables/Deliverable 1 - literature review.docx
+++ b/deliverables/Deliverable 1 - literature review.docx
@@ -1,6 +1,6 @@
 
 <file path=word/document.xml><?xml version="1.0" encoding="utf-8"?>
-<w:document xmlns:wpc="http://schemas.microsoft.com/office/word/2010/wordprocessingCanvas" xmlns:cx="http://schemas.microsoft.com/office/drawing/2014/chartex" xmlns:cx1="http://schemas.microsoft.com/office/drawing/2015/9/8/chartex" xmlns:cx2="http://schemas.microsoft.com/office/drawing/2015/10/21/chartex" xmlns:cx3="http://schemas.microsoft.com/office/drawing/2016/5/9/chartex" xmlns:cx4="http://schemas.microsoft.com/office/drawing/2016/5/10/chartex" xmlns:cx5="http://schemas.microsoft.com/office/drawing/2016/5/11/chartex" xmlns:cx6="http://schemas.microsoft.com/office/drawing/2016/5/12/chartex" xmlns:cx7="http://schemas.microsoft.com/office/drawing/2016/5/13/chartex" xmlns:cx8="http://schemas.microsoft.com/office/drawing/2016/5/14/chartex" xmlns:mc="http://schemas.openxmlformats.org/markup-compatibility/2006" xmlns:aink="http://schemas.microsoft.com/office/drawing/2016/ink" xmlns:am3d="http://schemas.microsoft.com/office/drawing/2017/model3d" xmlns:o="urn:schemas-microsoft-com:office:office" xmlns:oel="http://schemas.microsoft.com/office/2019/extlst" xmlns:r="http://schemas.openxmlformats.org/officeDocument/2006/relationships" xmlns:m="http://schemas.openxmlformats.org/officeDocument/2006/math" xmlns:v="urn:schemas-microsoft-com:vml" xmlns:wp14="http://schemas.microsoft.com/office/word/2010/wordprocessingDrawing" xmlns:wp="http://schemas.openxmlformats.org/drawingml/2006/wordprocessingDrawing" xmlns:w10="urn:schemas-microsoft-com:office:word" xmlns:w="http://schemas.openxmlformats.org/wordprocessingml/2006/main" xmlns:w14="http://schemas.microsoft.com/office/word/2010/wordml" xmlns:w15="http://schemas.microsoft.com/office/word/2012/wordml" xmlns:w16cex="http://schemas.microsoft.com/office/word/2018/wordml/cex" xmlns:w16cid="http://schemas.microsoft.com/office/word/2016/wordml/cid" xmlns:w16="http://schemas.microsoft.com/office/word/2018/wordml" xmlns:w16sdtdh="http://schemas.microsoft.com/office/word/2020/wordml/sdtdatahash" xmlns:w16se="http://schemas.microsoft.com/office/word/2015/wordml/symex" xmlns:wpg="http://schemas.microsoft.com/office/word/2010/wordprocessingGroup" xmlns:wpi="http://schemas.microsoft.com/office/word/2010/wordprocessingInk" xmlns:wne="http://schemas.microsoft.com/office/word/2006/wordml" xmlns:wps="http://schemas.microsoft.com/office/word/2010/wordprocessingShape" mc:Ignorable="w14 w15 w16se w16cid w16 w16cex w16sdtdh wp14">
+<w:document xmlns:wpc="http://schemas.microsoft.com/office/word/2010/wordprocessingCanvas" xmlns:cx="http://schemas.microsoft.com/office/drawing/2014/chartex" xmlns:cx1="http://schemas.microsoft.com/office/drawing/2015/9/8/chartex" xmlns:cx2="http://schemas.microsoft.com/office/drawing/2015/10/21/chartex" xmlns:cx3="http://schemas.microsoft.com/office/drawing/2016/5/9/chartex" xmlns:cx4="http://schemas.microsoft.com/office/drawing/2016/5/10/chartex" xmlns:cx5="http://schemas.microsoft.com/office/drawing/2016/5/11/chartex" xmlns:cx6="http://schemas.microsoft.com/office/drawing/2016/5/12/chartex" xmlns:cx7="http://schemas.microsoft.com/office/drawing/2016/5/13/chartex" xmlns:cx8="http://schemas.microsoft.com/office/drawing/2016/5/14/chartex" xmlns:mc="http://schemas.openxmlformats.org/markup-compatibility/2006" xmlns:aink="http://schemas.microsoft.com/office/drawing/2016/ink" xmlns:am3d="http://schemas.microsoft.com/office/drawing/2017/model3d" xmlns:o="urn:schemas-microsoft-com:office:office" xmlns:oel="http://schemas.microsoft.com/office/2019/extlst" xmlns:r="http://schemas.openxmlformats.org/officeDocument/2006/relationships" xmlns:m="http://schemas.openxmlformats.org/officeDocument/2006/math" xmlns:v="urn:schemas-microsoft-com:vml" xmlns:wp14="http://schemas.microsoft.com/office/word/2010/wordprocessingDrawing" xmlns:wp="http://schemas.openxmlformats.org/drawingml/2006/wordprocessingDrawing" xmlns:w10="urn:schemas-microsoft-com:office:word" xmlns:w="http://schemas.openxmlformats.org/wordprocessingml/2006/main" xmlns:w14="http://schemas.microsoft.com/office/word/2010/wordml" xmlns:w15="http://schemas.microsoft.com/office/word/2012/wordml" xmlns:w16cex="http://schemas.microsoft.com/office/word/2018/wordml/cex" xmlns:w16cid="http://schemas.microsoft.com/office/word/2016/wordml/cid" xmlns:w16="http://schemas.microsoft.com/office/word/2018/wordml" xmlns:w16du="http://schemas.microsoft.com/office/word/2023/wordml/word16du" xmlns:w16sdtdh="http://schemas.microsoft.com/office/word/2020/wordml/sdtdatahash" xmlns:w16se="http://schemas.microsoft.com/office/word/2015/wordml/symex" xmlns:wpg="http://schemas.microsoft.com/office/word/2010/wordprocessingGroup" xmlns:wpi="http://schemas.microsoft.com/office/word/2010/wordprocessingInk" xmlns:wne="http://schemas.microsoft.com/office/word/2006/wordml" xmlns:wps="http://schemas.microsoft.com/office/word/2010/wordprocessingShape" mc:Ignorable="w14 w15 w16se w16cid w16 w16cex w16sdtdh w16du wp14">
   <w:body>
     <w:p>
       <w:pPr>
@@ -141,19 +141,7 @@
         <w:rPr>
           <w:lang w:val="en-US"/>
         </w:rPr>
-        <w:t xml:space="preserve">This deliverable reports on the study of the literature review </w:t>
-      </w:r>
-      <w:r>
-        <w:rPr>
-          <w:lang w:val="en-US"/>
-        </w:rPr>
-        <w:t xml:space="preserve">on existing solutions for human vulnerability assessment and mitigation. The output of the review is </w:t>
-      </w:r>
-      <w:r>
-        <w:rPr>
-          <w:lang w:val="en-US"/>
-        </w:rPr>
-        <w:t>a user model for defining the sensible human factors, the best approaches to profile users</w:t>
+        <w:t>This deliverable reports on the study of the literature review on existing solutions for human vulnerability assessment and mitigation. The output of the review is a user model for defining the sensible human factors, the best approaches to profile users</w:t>
       </w:r>
       <w:r>
         <w:rPr>
@@ -165,19 +153,7 @@
         <w:rPr>
           <w:lang w:val="en-US"/>
         </w:rPr>
-        <w:t xml:space="preserve"> vulnerabilities and train</w:t>
-      </w:r>
-      <w:r>
-        <w:rPr>
-          <w:lang w:val="en-US"/>
-        </w:rPr>
-        <w:t xml:space="preserve"> </w:t>
-      </w:r>
-      <w:r>
-        <w:rPr>
-          <w:lang w:val="en-US"/>
-        </w:rPr>
-        <w:t xml:space="preserve">users against </w:t>
+        <w:t xml:space="preserve"> vulnerabilities and train users against </w:t>
       </w:r>
       <w:r>
         <w:rPr>
@@ -189,37 +165,7 @@
         <w:rPr>
           <w:lang w:val="en-US"/>
         </w:rPr>
-        <w:t xml:space="preserve">, </w:t>
-      </w:r>
-      <w:r>
-        <w:rPr>
-          <w:lang w:val="en-US"/>
-        </w:rPr>
-        <w:t xml:space="preserve">as well as </w:t>
-      </w:r>
-      <w:r>
-        <w:rPr>
-          <w:lang w:val="en-US"/>
-        </w:rPr>
-        <w:t xml:space="preserve">the </w:t>
-      </w:r>
-      <w:r>
-        <w:rPr>
-          <w:lang w:val="en-US"/>
-        </w:rPr>
-        <w:t xml:space="preserve">existing </w:t>
-      </w:r>
-      <w:r>
-        <w:rPr>
-          <w:lang w:val="en-US"/>
-        </w:rPr>
-        <w:t>no-code approaches</w:t>
-      </w:r>
-      <w:r>
-        <w:rPr>
-          <w:lang w:val="en-US"/>
-        </w:rPr>
-        <w:t>.</w:t>
+        <w:t>, as well as the existing no-code approaches.</w:t>
       </w:r>
     </w:p>
     <w:p>
@@ -420,21 +366,7 @@
         <w:rPr>
           <w:lang w:val="en-US"/>
         </w:rPr>
-        <w:t xml:space="preserve">Users, by their actions, represent a major source of vulnerabilities in digital security. For example, according to a Verizon study, 74% of cybersecurity breaches are caused by human error, which includes social engineering attacks, </w:t>
-      </w:r>
-      <w:proofErr w:type="gramStart"/>
-      <w:r>
-        <w:rPr>
-          <w:lang w:val="en-US"/>
-        </w:rPr>
-        <w:t>mistakes</w:t>
-      </w:r>
-      <w:proofErr w:type="gramEnd"/>
-      <w:r>
-        <w:rPr>
-          <w:lang w:val="en-US"/>
-        </w:rPr>
-        <w:t xml:space="preserve"> or misuse [1]. To effectively address cybersecurity challenges, it is essential to understand how humans interact with the digital environment thoroughly. It is necessary to identify possible weaknesses and assess how these can be exploited by malicious attackers. This is crucial to developing effective strategies and countermeasures to protect organizations' information and digital assets.</w:t>
+        <w:t>Users, by their actions, represent a major source of vulnerabilities in digital security. For example, according to a Verizon study, 74% of cybersecurity breaches are caused by human error, which includes social engineering attacks, mistakes or misuse [1]. To effectively address cybersecurity challenges, it is essential to understand how humans interact with the digital environment thoroughly. It is necessary to identify possible weaknesses and assess how these can be exploited by malicious attackers. This is crucial to developing effective strategies and countermeasures to protect organizations' information and digital assets.</w:t>
       </w:r>
     </w:p>
     <w:p>
@@ -487,16 +419,8 @@
         <w:rPr>
           <w:lang w:val="en-US"/>
         </w:rPr>
-        <w:t xml:space="preserve">Planning and conducting the </w:t>
-      </w:r>
-      <w:proofErr w:type="gramStart"/>
-      <w:r>
-        <w:rPr>
-          <w:lang w:val="en-US"/>
-        </w:rPr>
-        <w:t>SLR</w:t>
-      </w:r>
-      <w:proofErr w:type="gramEnd"/>
+        <w:t>Planning and conducting the SLR</w:t>
+      </w:r>
     </w:p>
     <w:p>
       <w:pPr>
@@ -1131,16 +1055,8 @@
         <w:rPr>
           <w:lang w:val="en-US"/>
         </w:rPr>
-        <w:t xml:space="preserve">The initial search of the digital library yielded a total of twenty-one potentially relevant publications. After checking for duplicates, a dataset of eighteen publications was obtained. In the end, this phase resulted in a total of eighteen publications. Each publication was then analyzed by examining the abstract, introduction, and conclusion, considering the other inclusion criteria defined in the previous section. After this step, eight publications were excluded, resulting in a final dataset of ten publications. Phase two allowed additional publications to be retrieved, bringing the final set to twelve </w:t>
-      </w:r>
-      <w:proofErr w:type="gramStart"/>
-      <w:r>
-        <w:rPr>
-          <w:lang w:val="en-US"/>
-        </w:rPr>
-        <w:t>publications</w:t>
-      </w:r>
-      <w:proofErr w:type="gramEnd"/>
+        <w:t>The initial search of the digital library yielded a total of twenty-one potentially relevant publications. After checking for duplicates, a dataset of eighteen publications was obtained. In the end, this phase resulted in a total of eighteen publications. Each publication was then analyzed by examining the abstract, introduction, and conclusion, considering the other inclusion criteria defined in the previous section. After this step, eight publications were excluded, resulting in a final dataset of ten publications. Phase two allowed additional publications to be retrieved, bringing the final set to twelve publications</w:t>
+      </w:r>
     </w:p>
     <w:p>
       <w:pPr>
@@ -3010,21 +2926,7 @@
         <w:rPr>
           <w:lang w:val="en-US"/>
         </w:rPr>
-        <w:t xml:space="preserve">Within the analyzed publications, three distinct approaches to data collection regarding human behaviors in digital environments emerged. In the following paragraphs, a detailed exposition of the techniques will be made, highlighting the peculiarities of </w:t>
-      </w:r>
-      <w:proofErr w:type="gramStart"/>
-      <w:r>
-        <w:rPr>
-          <w:lang w:val="en-US"/>
-        </w:rPr>
-        <w:t>each</w:t>
-      </w:r>
-      <w:proofErr w:type="gramEnd"/>
-      <w:r>
-        <w:rPr>
-          <w:lang w:val="en-US"/>
-        </w:rPr>
-        <w:t xml:space="preserve"> and providing a clear and comprehensive overview of the methodological process adopted. This insight will enable the complexity and richness of the s </w:t>
+        <w:t xml:space="preserve">Within the analyzed publications, three distinct approaches to data collection regarding human behaviors in digital environments emerged. In the following paragraphs, a detailed exposition of the techniques will be made, highlighting the peculiarities of each and providing a clear and comprehensive overview of the methodological process adopted. This insight will enable the complexity and richness of the s </w:t>
       </w:r>
       <w:proofErr w:type="spellStart"/>
       <w:r>
@@ -3099,21 +3001,7 @@
         <w:rPr>
           <w:lang w:val="en-US"/>
         </w:rPr>
-        <w:t xml:space="preserve">In the context of digital security, the goal of applying the KAB model is to identify factors that influence employees' information security behavior. Specifically, HAIS-Q leverages the KAB model to examine the relationship between employees' policy knowledge, </w:t>
-      </w:r>
-      <w:proofErr w:type="gramStart"/>
-      <w:r>
-        <w:rPr>
-          <w:lang w:val="en-US"/>
-        </w:rPr>
-        <w:t>attitudes</w:t>
-      </w:r>
-      <w:proofErr w:type="gramEnd"/>
-      <w:r>
-        <w:rPr>
-          <w:lang w:val="en-US"/>
-        </w:rPr>
-        <w:t xml:space="preserve"> and behaviors, thus providing a comprehensive framework for targeted and effective interventions in corporate information security.</w:t>
+        <w:t>In the context of digital security, the goal of applying the KAB model is to identify factors that influence employees' information security behavior. Specifically, HAIS-Q leverages the KAB model to examine the relationship between employees' policy knowledge, attitudes and behaviors, thus providing a comprehensive framework for targeted and effective interventions in corporate information security.</w:t>
       </w:r>
     </w:p>
     <w:p>
@@ -4893,16 +4781,8 @@
         <w:rPr>
           <w:lang w:val="en-US"/>
         </w:rPr>
-        <w:t xml:space="preserve">The fifth measure addresses physical/resource security and the individual's behavior to protect their resources from unauthorized access by providing workstation-specific </w:t>
-      </w:r>
-      <w:proofErr w:type="gramStart"/>
-      <w:r>
-        <w:rPr>
-          <w:lang w:val="en-US"/>
-        </w:rPr>
-        <w:t>guidance</w:t>
-      </w:r>
-      <w:proofErr w:type="gramEnd"/>
+        <w:t>The fifth measure addresses physical/resource security and the individual's behavior to protect their resources from unauthorized access by providing workstation-specific guidance</w:t>
+      </w:r>
     </w:p>
     <w:p>
       <w:pPr>
@@ -8123,21 +8003,7 @@
         <w:rPr>
           <w:lang w:val="en-US"/>
         </w:rPr>
-        <w:t xml:space="preserve"> et al. [13], which aims to assess the level of security knowledge and awareness by simulating other phishing attack techniques. One such simulated attack is clone phishing: in this mode, "phishers" imitate a legitimate website by replicating its design, structure, </w:t>
-      </w:r>
-      <w:proofErr w:type="gramStart"/>
-      <w:r>
-        <w:rPr>
-          <w:lang w:val="en-US"/>
-        </w:rPr>
-        <w:t>logos</w:t>
-      </w:r>
-      <w:proofErr w:type="gramEnd"/>
-      <w:r>
-        <w:rPr>
-          <w:lang w:val="en-US"/>
-        </w:rPr>
-        <w:t xml:space="preserve"> and images. These simulated sites usually induce the user to log in to a system with the intent of stealing information and compromising the security of the local computer, subsequently redirecting the user to malware-infected pages [13]. The first phase of this procedure involves cloning a Web site through various available tools designed to facilitate the creation of new sites using existing templates. Next, the abuse technique of "domain squatting" was adopted through the purchase of a "</w:t>
+        <w:t xml:space="preserve"> et al. [13], which aims to assess the level of security knowledge and awareness by simulating other phishing attack techniques. One such simulated attack is clone phishing: in this mode, "phishers" imitate a legitimate website by replicating its design, structure, logos and images. These simulated sites usually induce the user to log in to a system with the intent of stealing information and compromising the security of the local computer, subsequently redirecting the user to malware-infected pages [13]. The first phase of this procedure involves cloning a Web site through various available tools designed to facilitate the creation of new sites using existing templates. Next, the abuse technique of "domain squatting" was adopted through the purchase of a "</w:t>
       </w:r>
       <w:proofErr w:type="spellStart"/>
       <w:r>
@@ -10159,21 +10025,7 @@
         <w:rPr>
           <w:lang w:val="en-US"/>
         </w:rPr>
-        <w:t xml:space="preserve">Psychometric questionnaires, tools based on the analysis of cognitive and behavioral factors, focus on assessing users' knowledge, </w:t>
-      </w:r>
-      <w:proofErr w:type="gramStart"/>
-      <w:r>
-        <w:rPr>
-          <w:lang w:val="en-US"/>
-        </w:rPr>
-        <w:t>attitudes</w:t>
-      </w:r>
-      <w:proofErr w:type="gramEnd"/>
-      <w:r>
-        <w:rPr>
-          <w:lang w:val="en-US"/>
-        </w:rPr>
-        <w:t xml:space="preserve"> and behaviors regarding cybersecurity. Despite their relatively simple and inexpensive implementation, it is important to note that these questionnaires may not be completely effective in measuring users' actual behaviors in the face of threats because they rely on users' self- assessment, potentially leading to responses that are compliant but not reflective of reality or totally incorrect due to loss of user interest.</w:t>
+        <w:t>Psychometric questionnaires, tools based on the analysis of cognitive and behavioral factors, focus on assessing users' knowledge, attitudes and behaviors regarding cybersecurity. Despite their relatively simple and inexpensive implementation, it is important to note that these questionnaires may not be completely effective in measuring users' actual behaviors in the face of threats because they rely on users' self- assessment, potentially leading to responses that are compliant but not reflective of reality or totally incorrect due to loss of user interest.</w:t>
       </w:r>
     </w:p>
     <w:p>
@@ -11127,7 +10979,7 @@
 </file>
 
 <file path=word/numbering.xml><?xml version="1.0" encoding="utf-8"?>
-<w:numbering xmlns:wpc="http://schemas.microsoft.com/office/word/2010/wordprocessingCanvas" xmlns:cx="http://schemas.microsoft.com/office/drawing/2014/chartex" xmlns:cx1="http://schemas.microsoft.com/office/drawing/2015/9/8/chartex" xmlns:cx2="http://schemas.microsoft.com/office/drawing/2015/10/21/chartex" xmlns:cx3="http://schemas.microsoft.com/office/drawing/2016/5/9/chartex" xmlns:cx4="http://schemas.microsoft.com/office/drawing/2016/5/10/chartex" xmlns:cx5="http://schemas.microsoft.com/office/drawing/2016/5/11/chartex" xmlns:cx6="http://schemas.microsoft.com/office/drawing/2016/5/12/chartex" xmlns:cx7="http://schemas.microsoft.com/office/drawing/2016/5/13/chartex" xmlns:cx8="http://schemas.microsoft.com/office/drawing/2016/5/14/chartex" xmlns:mc="http://schemas.openxmlformats.org/markup-compatibility/2006" xmlns:aink="http://schemas.microsoft.com/office/drawing/2016/ink" xmlns:am3d="http://schemas.microsoft.com/office/drawing/2017/model3d" xmlns:o="urn:schemas-microsoft-com:office:office" xmlns:oel="http://schemas.microsoft.com/office/2019/extlst" xmlns:r="http://schemas.openxmlformats.org/officeDocument/2006/relationships" xmlns:m="http://schemas.openxmlformats.org/officeDocument/2006/math" xmlns:v="urn:schemas-microsoft-com:vml" xmlns:wp14="http://schemas.microsoft.com/office/word/2010/wordprocessingDrawing" xmlns:wp="http://schemas.openxmlformats.org/drawingml/2006/wordprocessingDrawing" xmlns:w10="urn:schemas-microsoft-com:office:word" xmlns:w="http://schemas.openxmlformats.org/wordprocessingml/2006/main" xmlns:w14="http://schemas.microsoft.com/office/word/2010/wordml" xmlns:w15="http://schemas.microsoft.com/office/word/2012/wordml" xmlns:w16cex="http://schemas.microsoft.com/office/word/2018/wordml/cex" xmlns:w16cid="http://schemas.microsoft.com/office/word/2016/wordml/cid" xmlns:w16="http://schemas.microsoft.com/office/word/2018/wordml" xmlns:w16sdtdh="http://schemas.microsoft.com/office/word/2020/wordml/sdtdatahash" xmlns:w16se="http://schemas.microsoft.com/office/word/2015/wordml/symex" xmlns:wpg="http://schemas.microsoft.com/office/word/2010/wordprocessingGroup" xmlns:wpi="http://schemas.microsoft.com/office/word/2010/wordprocessingInk" xmlns:wne="http://schemas.microsoft.com/office/word/2006/wordml" xmlns:wps="http://schemas.microsoft.com/office/word/2010/wordprocessingShape" mc:Ignorable="w14 w15 w16se w16cid w16 w16cex w16sdtdh wp14">
+<w:numbering xmlns:wpc="http://schemas.microsoft.com/office/word/2010/wordprocessingCanvas" xmlns:cx="http://schemas.microsoft.com/office/drawing/2014/chartex" xmlns:cx1="http://schemas.microsoft.com/office/drawing/2015/9/8/chartex" xmlns:cx2="http://schemas.microsoft.com/office/drawing/2015/10/21/chartex" xmlns:cx3="http://schemas.microsoft.com/office/drawing/2016/5/9/chartex" xmlns:cx4="http://schemas.microsoft.com/office/drawing/2016/5/10/chartex" xmlns:cx5="http://schemas.microsoft.com/office/drawing/2016/5/11/chartex" xmlns:cx6="http://schemas.microsoft.com/office/drawing/2016/5/12/chartex" xmlns:cx7="http://schemas.microsoft.com/office/drawing/2016/5/13/chartex" xmlns:cx8="http://schemas.microsoft.com/office/drawing/2016/5/14/chartex" xmlns:mc="http://schemas.openxmlformats.org/markup-compatibility/2006" xmlns:aink="http://schemas.microsoft.com/office/drawing/2016/ink" xmlns:am3d="http://schemas.microsoft.com/office/drawing/2017/model3d" xmlns:o="urn:schemas-microsoft-com:office:office" xmlns:oel="http://schemas.microsoft.com/office/2019/extlst" xmlns:r="http://schemas.openxmlformats.org/officeDocument/2006/relationships" xmlns:m="http://schemas.openxmlformats.org/officeDocument/2006/math" xmlns:v="urn:schemas-microsoft-com:vml" xmlns:wp14="http://schemas.microsoft.com/office/word/2010/wordprocessingDrawing" xmlns:wp="http://schemas.openxmlformats.org/drawingml/2006/wordprocessingDrawing" xmlns:w10="urn:schemas-microsoft-com:office:word" xmlns:w="http://schemas.openxmlformats.org/wordprocessingml/2006/main" xmlns:w14="http://schemas.microsoft.com/office/word/2010/wordml" xmlns:w15="http://schemas.microsoft.com/office/word/2012/wordml" xmlns:w16cex="http://schemas.microsoft.com/office/word/2018/wordml/cex" xmlns:w16cid="http://schemas.microsoft.com/office/word/2016/wordml/cid" xmlns:w16="http://schemas.microsoft.com/office/word/2018/wordml" xmlns:w16du="http://schemas.microsoft.com/office/word/2023/wordml/word16du" xmlns:w16sdtdh="http://schemas.microsoft.com/office/word/2020/wordml/sdtdatahash" xmlns:w16se="http://schemas.microsoft.com/office/word/2015/wordml/symex" xmlns:wpg="http://schemas.microsoft.com/office/word/2010/wordprocessingGroup" xmlns:wpi="http://schemas.microsoft.com/office/word/2010/wordprocessingInk" xmlns:wne="http://schemas.microsoft.com/office/word/2006/wordml" xmlns:wps="http://schemas.microsoft.com/office/word/2010/wordprocessingShape" mc:Ignorable="w14 w15 w16se w16cid w16 w16cex w16sdtdh w16du wp14">
   <w:abstractNum w:abstractNumId="0" w15:restartNumberingAfterBreak="0">
     <w:nsid w:val="0A62724C"/>
     <w:multiLevelType w:val="hybridMultilevel"/>
@@ -12565,7 +12417,7 @@
 </file>
 
 <file path=word/styles.xml><?xml version="1.0" encoding="utf-8"?>
-<w:styles xmlns:mc="http://schemas.openxmlformats.org/markup-compatibility/2006" xmlns:r="http://schemas.openxmlformats.org/officeDocument/2006/relationships" xmlns:w="http://schemas.openxmlformats.org/wordprocessingml/2006/main" xmlns:w14="http://schemas.microsoft.com/office/word/2010/wordml" xmlns:w15="http://schemas.microsoft.com/office/word/2012/wordml" xmlns:w16cex="http://schemas.microsoft.com/office/word/2018/wordml/cex" xmlns:w16cid="http://schemas.microsoft.com/office/word/2016/wordml/cid" xmlns:w16="http://schemas.microsoft.com/office/word/2018/wordml" xmlns:w16sdtdh="http://schemas.microsoft.com/office/word/2020/wordml/sdtdatahash" xmlns:w16se="http://schemas.microsoft.com/office/word/2015/wordml/symex" mc:Ignorable="w14 w15 w16se w16cid w16 w16cex w16sdtdh">
+<w:styles xmlns:mc="http://schemas.openxmlformats.org/markup-compatibility/2006" xmlns:r="http://schemas.openxmlformats.org/officeDocument/2006/relationships" xmlns:w="http://schemas.openxmlformats.org/wordprocessingml/2006/main" xmlns:w14="http://schemas.microsoft.com/office/word/2010/wordml" xmlns:w15="http://schemas.microsoft.com/office/word/2012/wordml" xmlns:w16cex="http://schemas.microsoft.com/office/word/2018/wordml/cex" xmlns:w16cid="http://schemas.microsoft.com/office/word/2016/wordml/cid" xmlns:w16="http://schemas.microsoft.com/office/word/2018/wordml" xmlns:w16du="http://schemas.microsoft.com/office/word/2023/wordml/word16du" xmlns:w16sdtdh="http://schemas.microsoft.com/office/word/2020/wordml/sdtdatahash" xmlns:w16se="http://schemas.microsoft.com/office/word/2015/wordml/symex" mc:Ignorable="w14 w15 w16se w16cid w16 w16cex w16sdtdh w16du">
   <w:docDefaults>
     <w:rPrDefault>
       <w:rPr>

</xml_diff>